<commit_message>
Add Shiveshwar Kumar Sah student details to submission documents
</commit_message>
<xml_diff>
--- a/docs/report.docx
+++ b/docs/report.docx
@@ -15,7 +15,7 @@
       <w:r>
         <w:t>Fundamentals of AI undergraduate case study</w:t>
         <w:br/>
-        <w:t>[Student Name]   [Roll Number]</w:t>
+        <w:t>Shiveshwar Kumar Sah   BL.EN.U4CSE23072</w:t>
         <w:br/>
         <w:t>[Institution]   [Faculty]   [Submission Date]</w:t>
       </w:r>
@@ -5567,7 +5567,7 @@
     </w:p>
     <w:p>
       <w:r>
-        <w:t>Use docs/demo_script.md for a short demonstration, docs/code_walkthrough.md for source-reading order and docs/viva_guide.md for explanations. Replace only the student metadata placeholders before submission. AI assisted the implementation, testing and artifact preparation; adapt any disclosure to course policy without inventing authorship declarations.</w:t>
+        <w:t>Use docs/demo_script.md for a short demonstration, docs/code_walkthrough.md for source-reading order and docs/viva_guide.md for explanations. Fill in the institution, faculty and submission date before submission. AI assisted the implementation, testing and artifact preparation; adapt any disclosure to course policy without inventing authorship declarations.</w:t>
       </w:r>
     </w:p>
     <w:p>

</xml_diff>